<commit_message>
docs: manual v0.0.4 without developer-level details
</commit_message>
<xml_diff>
--- a/docs/manual/PriceRadar_Руководство_пользователя_v0.0.4.docx
+++ b/docs/manual/PriceRadar_Руководство_пользователя_v0.0.4.docx
@@ -65,7 +65,7 @@
         <w:ind w:left="200"/>
       </w:pPr>
       <w:r>
-        <w:t xml:space="preserve">Скриншоты сняты 12 октября 2026, новые функции 0.0.4 — 13 октября 2026 на рабочем сервере на тестовом стенде, подключённом к рабочим источникам и к локальной модели ИИ, с учётной записью «Анна Петрова» (менеджер). Цены и состав строк на рабочем сервере меняются от поиска к поиску.</w:t>
+        <w:t xml:space="preserve">Скриншоты сняты 12 октября 2026, новые функции 0.0.4 — 13 октября 2026. Цены и состав строк меняются от поиска к поиску.</w:t>
       </w:r>
     </w:p>
     <w:p>
@@ -235,7 +235,7 @@
           </w:pPr>
           <w:hyperlink w:history="1" w:anchor="_Toc7">
             <w:r>
-              <w:t xml:space="preserve">1.5. Ситилинк без ручного прогрева</w:t>
+              <w:t xml:space="preserve">1.5. Ситилинк снова в поиске</w:t>
             </w:r>
             <w:r>
               <w:tab/>
@@ -961,7 +961,7 @@
           </w:pPr>
           <w:hyperlink w:history="1" w:anchor="_Toc39">
             <w:r>
-              <w:t xml:space="preserve">11. Как получить партнёрский API дистрибьютора</w:t>
+              <w:t xml:space="preserve">11. Как получить доступ к ценам дистрибьютора</w:t>
             </w:r>
             <w:r>
               <w:tab/>
@@ -1053,7 +1053,7 @@
           </w:pPr>
           <w:hyperlink w:history="1" w:anchor="_Toc43">
             <w:r>
-              <w:t xml:space="preserve">11.4. Поставщики без API</w:t>
+              <w:t xml:space="preserve">11.4. Поставщики без автоматической выгрузки</w:t>
             </w:r>
             <w:r>
               <w:tab/>
@@ -1075,7 +1075,7 @@
           </w:pPr>
           <w:hyperlink w:history="1" w:anchor="_Toc44">
             <w:r>
-              <w:t xml:space="preserve">12. Как проверяется качество поиска</w:t>
+              <w:t xml:space="preserve">12. Что планируется дальше</w:t>
             </w:r>
             <w:r>
               <w:tab/>
@@ -1097,7 +1097,7 @@
           </w:pPr>
           <w:hyperlink w:history="1" w:anchor="_Toc45">
             <w:r>
-              <w:t xml:space="preserve">13. Что планируется дальше</w:t>
+              <w:t xml:space="preserve">13. Частые вопросы</w:t>
             </w:r>
             <w:r>
               <w:tab/>
@@ -1105,28 +1105,6 @@
             <w:r>
               <w:fldChar w:fldCharType="begin" w:dirty="true"/>
               <w:instrText xml:space="preserve">PAGEREF _Toc45 \h</w:instrText>
-              <w:fldChar w:fldCharType="separate"/>
-              <w:fldChar w:fldCharType="end"/>
-            </w:r>
-          </w:hyperlink>
-        </w:p>
-        <w:p>
-          <w:pPr>
-            <w:pStyle w:val="TOC1"/>
-            <w:tabs>
-              <w:tab w:val="right" w:pos="9638" w:leader="dot"/>
-            </w:tabs>
-          </w:pPr>
-          <w:hyperlink w:history="1" w:anchor="_Toc46">
-            <w:r>
-              <w:t xml:space="preserve">14. Частые вопросы</w:t>
-            </w:r>
-            <w:r>
-              <w:tab/>
-            </w:r>
-            <w:r>
-              <w:fldChar w:fldCharType="begin" w:dirty="true"/>
-              <w:instrText xml:space="preserve">PAGEREF _Toc46 \h</w:instrText>
               <w:fldChar w:fldCharType="separate"/>
               <w:fldChar w:fldCharType="end"/>
             </w:r>
@@ -2706,27 +2684,9 @@
       </w:pPr>
       <w:bookmarkStart w:name="_Toc7" w:id="7"/>
       <w:r>
-        <w:t xml:space="preserve">1.5. Ситилинк без ручного прогрева</w:t>
+        <w:t xml:space="preserve">1.5. Ситилинк снова в поиске</w:t>
       </w:r>
       <w:bookmarkEnd w:id="7"/>
-    </w:p>
-    <w:p>
-      <w:pPr>
-        <w:spacing w:after="120"/>
-      </w:pPr>
-      <w:r>
-        <w:t xml:space="preserve">Ситилинк защищён системой Qrator: с адреса сервера (дата-центр) он отвечал ошибкой 429, и раньше администратору приходилось вручную «прогревать» браузер через VNC. С офисного адреса компании Ситилинк открывается обычным браузером без проверок. Поэтому с версии 0.0.4 поиск по Ситилинку выполняет </w:t>
-      </w:r>
-      <w:r>
-        <w:rPr>
-          <w:b/>
-          <w:bCs/>
-        </w:rPr>
-        <w:t xml:space="preserve">офисный агент</w:t>
-      </w:r>
-      <w:r>
-        <w:t xml:space="preserve"> — небольшая программа на офисном компьютере, к которой сервер обращается через защищённый туннель.</w:t>
-      </w:r>
     </w:p>
     <w:p>
       <w:pPr>
@@ -2738,7 +2698,7 @@
         <w:spacing w:after="60"/>
       </w:pPr>
       <w:r>
-        <w:t xml:space="preserve">Закупщику ничего делать не нужно: Ситилинк просто появляется в результатах, как остальные источники.</w:t>
+        <w:t xml:space="preserve">Ситилинк снова стабильно появляется в результатах, как остальные источники. Закупщику ничего делать не нужно.</w:t>
       </w:r>
     </w:p>
     <w:p>
@@ -2764,33 +2724,7 @@
         <w:spacing w:after="60"/>
       </w:pPr>
       <w:r>
-        <w:t xml:space="preserve">Агент работает, пока включён офисный компьютер, на котором он установлен. Когда компьютер выключен, Ситилинк в поиске показывается как недоступный; остальные источники работают как обычно.</w:t>
-      </w:r>
-    </w:p>
-    <w:p>
-      <w:pPr>
-        <w:pStyle w:val="ListParagraph"/>
-        <w:numPr>
-          <w:ilvl w:val="0"/>
-          <w:numId w:val="2"/>
-        </w:numPr>
-        <w:spacing w:after="60"/>
-      </w:pPr>
-      <w:r>
-        <w:t xml:space="preserve">Ответы Ситилинка кэшируются на 20 минут, запросы идут не чаще одного в 2,5 секунды — чтобы не создавать нагрузку на сайт.</w:t>
-      </w:r>
-    </w:p>
-    <w:p>
-      <w:pPr>
-        <w:pBdr>
-          <w:left w:val="single" w:color="4F46E5" w:sz="18" w:space="8"/>
-        </w:pBdr>
-        <w:shd w:fill="EEF2FF" w:color="auto" w:val="clear"/>
-        <w:spacing w:after="160" w:before="120"/>
-        <w:ind w:left="200"/>
-      </w:pPr>
-      <w:r>
-        <w:t xml:space="preserve">Для администратора: установка и проверка агента — scripts/office-agent/README.md в репозитории. Перенести агента на другой офисный компьютер, который всегда включён, можно той же командой установки.</w:t>
+        <w:t xml:space="preserve">Иногда (например, ночью или в выходные) Ситилинк может быть временно недоступен — остальные источники при этом работают как обычно.</w:t>
       </w:r>
     </w:p>
     <w:p>
@@ -3204,7 +3138,7 @@
         <w:ind w:left="200"/>
       </w:pPr>
       <w:r>
-        <w:t xml:space="preserve">Не вошло в 0.0.3: проверка карточек Wildberries (площадка закрыла доступ к карточкам), подключение OCS и MERLION (нужен API-доступ, раздел 11) и приоритет дистрибьюторов над маркетплейсами (нужен порог разницы в цене от отдела закупок).</w:t>
+        <w:t xml:space="preserve">Не вошло в 0.0.3: проверка карточек Wildberries (площадка закрыла доступ к карточкам), подключение OCS и MERLION (нужен доступ от дистрибьютора, раздел 11) и приоритет дистрибьюторов над маркетплейсами (нужен порог разницы в цене от отдела закупок).</w:t>
       </w:r>
     </w:p>
     <w:p>
@@ -3827,7 +3761,7 @@
         <w:ind w:left="200"/>
       </w:pPr>
       <w:r>
-        <w:t xml:space="preserve">Как мы измеряем качество: 30 контрольных запросов прогоняются через рабочий поиск. Нужная модель в первых трёх строках вкладки «Маркетплейсы» — 87% запросов (было 73%), во вкладке «Дистрибуторы» — 100% из 20 запросов, где дистрибуторы что-то нашли. Пустых выдач — 3 из 30 (было 6). Подробнее — раздел 12.</w:t>
+        <w:t xml:space="preserve">Качество поиска выросло: Нужная модель в первых трёх строках вкладки «Маркетплейсы» — 87% запросов (было 73%), во вкладке «Дистрибуторы» — 100% из 20 запросов, где дистрибуторы что-то нашли. Пустых выдач — 3 из 30 (было 6). </w:t>
       </w:r>
     </w:p>
     <w:p>
@@ -4077,7 +4011,7 @@
         <w:spacing w:after="60"/>
       </w:pPr>
       <w:r>
-        <w:t xml:space="preserve">Яндекс Маркет, Мегамаркет и DNS временно выключены: площадки блокируют адрес сервера.</w:t>
+        <w:t xml:space="preserve">Яндекс Маркет, Мегамаркет и DNS временно выключены: площадки не пускают автоматический поиск.</w:t>
       </w:r>
     </w:p>
     <w:p>
@@ -6608,7 +6542,7 @@
         <w:spacing w:after="120"/>
       </w:pPr>
       <w:r>
-        <w:t xml:space="preserve">ИИ работает на локальной модели компании (vLLM, Qwen). Запросы и цены никуда не отправляются. Главный принцип: ИИ подсказывает, решает менеджер. Отбор строк и порядок в таблице делают проверяемые правила; ИИ видит только то, что ему передал сервер, а его ответы проверяются кодом.</w:t>
+        <w:t xml:space="preserve">ИИ работает внутри компании. Запросы и цены никуда не отправляются. Главный принцип: ИИ подсказывает, решает менеджер. Отбор строк и порядок в таблице делают проверяемые правила; ИИ видит только то, что ему передал сервер, а его ответы проверяются кодом.</w:t>
       </w:r>
     </w:p>
     <w:tbl>
@@ -8105,7 +8039,7 @@
           </w:tcPr>
           <w:p>
             <w:r>
-              <w:t xml:space="preserve">Работает (офисный агент, с 0.0.4)</w:t>
+              <w:t xml:space="preserve">Работает (с 0.0.4)</w:t>
             </w:r>
           </w:p>
         </w:tc>
@@ -8128,7 +8062,7 @@
           </w:tcPr>
           <w:p>
             <w:r>
-              <w:t xml:space="preserve">Недоступен, пока выключен офисный компьютер с агентом (раздел 1.5)</w:t>
+              <w:t xml:space="preserve">Иногда временно недоступен — раздел 1.5</w:t>
             </w:r>
           </w:p>
         </w:tc>
@@ -8196,7 +8130,7 @@
           </w:tcPr>
           <w:p>
             <w:r>
-              <w:t xml:space="preserve">Часть запросов по таймауту</w:t>
+              <w:t xml:space="preserve">Иногда не успевает ответить</w:t>
             </w:r>
           </w:p>
         </w:tc>
@@ -8267,7 +8201,7 @@
           </w:tcPr>
           <w:p>
             <w:r>
-              <w:t xml:space="preserve">Площадки блокируют адрес сервера (капча, ServicePipe)</w:t>
+              <w:t xml:space="preserve">Площадки не пускают автоматический поиск</w:t>
             </w:r>
           </w:p>
         </w:tc>
@@ -8335,7 +8269,7 @@
           </w:tcPr>
           <w:p>
             <w:r>
-              <w:t xml:space="preserve">Защита Qrator отклоняет сессию</w:t>
+              <w:t xml:space="preserve">Площадка не пускает автоматический поиск</w:t>
             </w:r>
           </w:p>
         </w:tc>
@@ -8520,7 +8454,7 @@
           </w:tcPr>
           <w:p>
             <w:r>
-              <w:t xml:space="preserve">Открытый прайс-лист pricexml.zip, обновление раз в час; дилерская колонка F, пересчёт из USD по курсу прайса</w:t>
+              <w:t xml:space="preserve">Дилерский прайс-лист, обновляется раз в час; цены в рублях по курсу прайса</w:t>
             </w:r>
           </w:p>
         </w:tc>
@@ -8591,7 +8525,7 @@
           </w:tcPr>
           <w:p>
             <w:r>
-              <w:t xml:space="preserve">Публичный поиск srv-trade.ru, цены сайта</w:t>
+              <w:t xml:space="preserve">Цены с сайта srv-trade.ru</w:t>
             </w:r>
           </w:p>
         </w:tc>
@@ -8659,7 +8593,7 @@
           </w:tcPr>
           <w:p>
             <w:r>
-              <w:t xml:space="preserve">Публичный поиск servermall.ru, цена базовой конфигурации; новые и восстановленные</w:t>
+              <w:t xml:space="preserve">Цены с сайта servermall.ru (базовая конфигурация); новые и восстановленные</w:t>
             </w:r>
           </w:p>
         </w:tc>
@@ -8730,7 +8664,7 @@
           </w:tcPr>
           <w:p>
             <w:r>
-              <w:t xml:space="preserve">Интеграция написана, нужен API-доступ — раздел 11</w:t>
+              <w:t xml:space="preserve">Подключим, как только дистрибьютор даст доступ — раздел 11</w:t>
             </w:r>
           </w:p>
         </w:tc>
@@ -8798,7 +8732,7 @@
           </w:tcPr>
           <w:p>
             <w:r>
-              <w:t xml:space="preserve">Есть партнёрский API; после получения логина — доработка 1–2 дня</w:t>
+              <w:t xml:space="preserve">Подключим после получения доступа от дистрибьютора</w:t>
             </w:r>
           </w:p>
         </w:tc>
@@ -8882,7 +8816,7 @@
       </w:pPr>
       <w:bookmarkStart w:name="_Toc39" w:id="39"/>
       <w:r>
-        <w:t xml:space="preserve">11. Как получить партнёрский API дистрибьютора</w:t>
+        <w:t xml:space="preserve">11. Как получить доступ к ценам дистрибьютора</w:t>
       </w:r>
       <w:bookmarkEnd w:id="39"/>
     </w:p>
@@ -8891,7 +8825,7 @@
         <w:spacing w:after="120"/>
       </w:pPr>
       <w:r>
-        <w:t xml:space="preserve">Закупочные цены и остатки дистрибьюторы отдают только партнёрам по договору. Для MERLION и OCS программная часть готова — нужен доступ, который запрашивает менеджер, ведущий работу с дистрибьютором. NETLAB уже работает через открытый прайс-лист; API NETLAB даст остатки по складам точнее.</w:t>
+        <w:t xml:space="preserve">Закупочные цены и остатки дистрибьюторы отдают только партнёрам по договору. Для MERLION и OCS всё готово — нужен только доступ, который запрашивает менеджер, ведущий работу с дистрибьютором. NETLAB уже подключён через прайс-лист.</w:t>
       </w:r>
     </w:p>
     <w:p>
@@ -8927,7 +8861,7 @@
         <w:spacing w:after="60"/>
       </w:pPr>
       <w:r>
-        <w:t xml:space="preserve">Отправьте запрос персональному менеджеру дистрибьютора (шаблон — 10.3).</w:t>
+        <w:t xml:space="preserve">Отправьте запрос персональному менеджеру дистрибьютора (шаблон — 11.3).</w:t>
       </w:r>
     </w:p>
     <w:p>
@@ -8940,7 +8874,7 @@
         <w:spacing w:after="60"/>
       </w:pPr>
       <w:r>
-        <w:t xml:space="preserve">Укажите IP-адрес сервера Price Radar для белого списка — его даст разработчик.</w:t>
+        <w:t xml:space="preserve">Полученные логин и пароль передайте ответственному за Price Radar лично, не в общем чате.</w:t>
       </w:r>
     </w:p>
     <w:p>
@@ -8953,20 +8887,7 @@
         <w:spacing w:after="60"/>
       </w:pPr>
       <w:r>
-        <w:t xml:space="preserve">Логин, пароль или ключ передайте разработчику защищённым способом, не в общем чате.</w:t>
-      </w:r>
-    </w:p>
-    <w:p>
-      <w:pPr>
-        <w:pStyle w:val="ListParagraph"/>
-        <w:numPr>
-          <w:ilvl w:val="0"/>
-          <w:numId w:val="5"/>
-        </w:numPr>
-        <w:spacing w:after="60"/>
-      </w:pPr>
-      <w:r>
-        <w:t xml:space="preserve">Разработчик подключит источник и сообщит, когда появятся B2B-цены.</w:t>
+        <w:t xml:space="preserve">Когда дистрибьютор будет подключён, его закупочные цены появятся во вкладке «Дистрибуторы».</w:t>
       </w:r>
     </w:p>
     <w:p>
@@ -9148,7 +9069,7 @@
           </w:tcPr>
           <w:p>
             <w:r>
-              <w:t xml:space="preserve">Доступ к веб-сервису mlservice3 (SOAP), API-логин вида «КОД|API»</w:t>
+              <w:t xml:space="preserve">Доступ к автоматической выгрузке цен и остатков</w:t>
             </w:r>
           </w:p>
         </w:tc>
@@ -9219,7 +9140,7 @@
           </w:tcPr>
           <w:p>
             <w:r>
-              <w:t xml:space="preserve">API-ключ Partners Connector и IP сервера в белый список; город и склад отгрузки</w:t>
+              <w:t xml:space="preserve">Доступ к автоматической выгрузке цен и остатков; укажите город и склад отгрузки</w:t>
             </w:r>
           </w:p>
         </w:tc>
@@ -9265,7 +9186,7 @@
           </w:tcPr>
           <w:p>
             <w:r>
-              <w:t xml:space="preserve">Персональный менеджер; netlab.ru → «Партнёрам» → «Сервисы B2B и API»</w:t>
+              <w:t xml:space="preserve">Персональный менеджер; netlab.ru → «Партнёрам» → «Сервисы B2B»</w:t>
             </w:r>
           </w:p>
         </w:tc>
@@ -9287,7 +9208,7 @@
           </w:tcPr>
           <w:p>
             <w:r>
-              <w:t xml:space="preserve">Учётная запись NLDealer с правом web-services (необязательно — прайс уже работает)</w:t>
+              <w:t xml:space="preserve">Не требуется — прайс уже подключён</w:t>
             </w:r>
           </w:p>
         </w:tc>
@@ -9358,7 +9279,7 @@
           </w:tcPr>
           <w:p>
             <w:r>
-              <w:t xml:space="preserve">Доступ к веб-сервисам B2B (SOAP, api.treolan.ru)</w:t>
+              <w:t xml:space="preserve">Доступ к автоматической выгрузке цен и остатков</w:t>
             </w:r>
           </w:p>
         </w:tc>
@@ -9380,7 +9301,7 @@
         <w:ind w:left="400"/>
       </w:pPr>
       <w:r>
-        <w:t xml:space="preserve">Тема: Доступ к API для ГК «Перемена» (партнёр, код клиента ______)</w:t>
+        <w:t xml:space="preserve">Тема: Доступ к выгрузке цен и остатков для ГК «Перемена» (код клиента ______)</w:t>
       </w:r>
     </w:p>
     <w:p>
@@ -9389,7 +9310,7 @@
         <w:ind w:left="400"/>
       </w:pPr>
       <w:r>
-        <w:t xml:space="preserve">Здравствуйте! Мы — ваш партнёр ГК «Перемена» (код клиента ______, ИНН ______). Просим предоставить доступ к партнёрскому API для автоматического получения цен и остатков во внутреннюю систему закупок.</w:t>
+        <w:t xml:space="preserve">Здравствуйте! Мы — ваш партнёр ГК «Перемена» (код клиента ______, ИНН ______). Просим предоставить доступ к автоматической выгрузке цен и остатков для нашей внутренней системы закупок.</w:t>
       </w:r>
     </w:p>
     <w:p>
@@ -9398,16 +9319,7 @@
         <w:ind w:left="400"/>
       </w:pPr>
       <w:r>
-        <w:t xml:space="preserve">Нужно: учётные данные для API, ссылка на документацию и, если требуется, добавление IP-адреса нашего сервера ______ в белый список.</w:t>
-      </w:r>
-    </w:p>
-    <w:p>
-      <w:pPr>
-        <w:spacing w:after="120"/>
-        <w:ind w:left="400"/>
-      </w:pPr>
-      <w:r>
-        <w:t xml:space="preserve">Контакт технического специалиста: ______. Спасибо!</w:t>
+        <w:t xml:space="preserve">Технические детали подключения согласует наш специалист: ______. Спасибо!</w:t>
       </w:r>
     </w:p>
     <w:p>
@@ -9416,7 +9328,7 @@
       </w:pPr>
       <w:bookmarkStart w:name="_Toc43" w:id="43"/>
       <w:r>
-        <w:t xml:space="preserve">11.4. Поставщики без API</w:t>
+        <w:t xml:space="preserve">11.4. Поставщики без автоматической выгрузки</w:t>
       </w:r>
       <w:bookmarkEnd w:id="43"/>
     </w:p>
@@ -9435,502 +9347,9 @@
       </w:pPr>
       <w:bookmarkStart w:name="_Toc44" w:id="44"/>
       <w:r>
-        <w:t xml:space="preserve">12. Как проверяется качество поиска</w:t>
+        <w:t xml:space="preserve">12. Что планируется дальше</w:t>
       </w:r>
       <w:bookmarkEnd w:id="44"/>
-    </w:p>
-    <w:p>
-      <w:pPr>
-        <w:spacing w:after="120"/>
-      </w:pPr>
-      <w:r>
-        <w:t xml:space="preserve">В проекте есть набор из 30 контрольных запросов (процессоры, картриджи, SSD, видеокарты, мониторы, сеть, серверы). После каждого изменения поиска набор прогоняется на рабочем сервере, и считается, сколько из первых трёх строк каждой вкладки — нужная модель.</w:t>
-      </w:r>
-    </w:p>
-    <w:tbl>
-      <w:tblPr>
-        <w:tblW w:type="dxa" w:w="9638"/>
-        <w:tblBorders>
-          <w:top w:val="single" w:color="auto" w:sz="4"/>
-          <w:left w:val="single" w:color="auto" w:sz="4"/>
-          <w:bottom w:val="single" w:color="auto" w:sz="4"/>
-          <w:right w:val="single" w:color="auto" w:sz="4"/>
-          <w:insideH w:val="single" w:color="auto" w:sz="4"/>
-          <w:insideV w:val="single" w:color="auto" w:sz="4"/>
-        </w:tblBorders>
-      </w:tblPr>
-      <w:tblGrid>
-        <w:gridCol w:w="4600"/>
-        <w:gridCol w:w="2400"/>
-        <w:gridCol w:w="2638"/>
-      </w:tblGrid>
-      <w:tr>
-        <w:trPr>
-          <w:tblHeader/>
-        </w:trPr>
-        <w:tc>
-          <w:tcPr>
-            <w:tcW w:type="dxa" w:w="4600"/>
-            <w:tcBorders>
-              <w:top w:val="single" w:color="C7CCD6" w:sz="4"/>
-              <w:left w:val="single" w:color="C7CCD6" w:sz="4"/>
-              <w:bottom w:val="single" w:color="C7CCD6" w:sz="4"/>
-              <w:right w:val="single" w:color="C7CCD6" w:sz="4"/>
-            </w:tcBorders>
-            <w:shd w:fill="1E3A8A" w:color="auto" w:val="clear"/>
-            <w:tcMar>
-              <w:top w:type="dxa" w:w="60"/>
-              <w:left w:type="dxa" w:w="100"/>
-              <w:bottom w:type="dxa" w:w="60"/>
-              <w:right w:type="dxa" w:w="100"/>
-            </w:tcMar>
-          </w:tcPr>
-          <w:p>
-            <w:r>
-              <w:rPr>
-                <w:b/>
-                <w:bCs/>
-                <w:color w:val="FFFFFF"/>
-              </w:rPr>
-              <w:t xml:space="preserve">Показатель</w:t>
-            </w:r>
-          </w:p>
-        </w:tc>
-        <w:tc>
-          <w:tcPr>
-            <w:tcW w:type="dxa" w:w="2400"/>
-            <w:tcBorders>
-              <w:top w:val="single" w:color="C7CCD6" w:sz="4"/>
-              <w:left w:val="single" w:color="C7CCD6" w:sz="4"/>
-              <w:bottom w:val="single" w:color="C7CCD6" w:sz="4"/>
-              <w:right w:val="single" w:color="C7CCD6" w:sz="4"/>
-            </w:tcBorders>
-            <w:shd w:fill="1E3A8A" w:color="auto" w:val="clear"/>
-            <w:tcMar>
-              <w:top w:type="dxa" w:w="60"/>
-              <w:left w:type="dxa" w:w="100"/>
-              <w:bottom w:type="dxa" w:w="60"/>
-              <w:right w:type="dxa" w:w="100"/>
-            </w:tcMar>
-          </w:tcPr>
-          <w:p>
-            <w:r>
-              <w:rPr>
-                <w:b/>
-                <w:bCs/>
-                <w:color w:val="FFFFFF"/>
-              </w:rPr>
-              <w:t xml:space="preserve">До 0.0.2</w:t>
-            </w:r>
-          </w:p>
-        </w:tc>
-        <w:tc>
-          <w:tcPr>
-            <w:tcW w:type="dxa" w:w="2638"/>
-            <w:tcBorders>
-              <w:top w:val="single" w:color="C7CCD6" w:sz="4"/>
-              <w:left w:val="single" w:color="C7CCD6" w:sz="4"/>
-              <w:bottom w:val="single" w:color="C7CCD6" w:sz="4"/>
-              <w:right w:val="single" w:color="C7CCD6" w:sz="4"/>
-            </w:tcBorders>
-            <w:shd w:fill="1E3A8A" w:color="auto" w:val="clear"/>
-            <w:tcMar>
-              <w:top w:type="dxa" w:w="60"/>
-              <w:left w:type="dxa" w:w="100"/>
-              <w:bottom w:type="dxa" w:w="60"/>
-              <w:right w:type="dxa" w:w="100"/>
-            </w:tcMar>
-          </w:tcPr>
-          <w:p>
-            <w:r>
-              <w:rPr>
-                <w:b/>
-                <w:bCs/>
-                <w:color w:val="FFFFFF"/>
-              </w:rPr>
-              <w:t xml:space="preserve">0.0.2</w:t>
-            </w:r>
-          </w:p>
-        </w:tc>
-      </w:tr>
-      <w:tr>
-        <w:tc>
-          <w:tcPr>
-            <w:tcW w:type="dxa" w:w="4600"/>
-            <w:tcBorders>
-              <w:top w:val="single" w:color="C7CCD6" w:sz="4"/>
-              <w:left w:val="single" w:color="C7CCD6" w:sz="4"/>
-              <w:bottom w:val="single" w:color="C7CCD6" w:sz="4"/>
-              <w:right w:val="single" w:color="C7CCD6" w:sz="4"/>
-            </w:tcBorders>
-            <w:tcMar>
-              <w:top w:type="dxa" w:w="60"/>
-              <w:left w:type="dxa" w:w="100"/>
-              <w:bottom w:type="dxa" w:w="60"/>
-              <w:right w:type="dxa" w:w="100"/>
-            </w:tcMar>
-          </w:tcPr>
-          <w:p>
-            <w:r>
-              <w:t xml:space="preserve">Нужная модель в топ‑3 (маркетплейсы)</w:t>
-            </w:r>
-          </w:p>
-        </w:tc>
-        <w:tc>
-          <w:tcPr>
-            <w:tcW w:type="dxa" w:w="2400"/>
-            <w:tcBorders>
-              <w:top w:val="single" w:color="C7CCD6" w:sz="4"/>
-              <w:left w:val="single" w:color="C7CCD6" w:sz="4"/>
-              <w:bottom w:val="single" w:color="C7CCD6" w:sz="4"/>
-              <w:right w:val="single" w:color="C7CCD6" w:sz="4"/>
-            </w:tcBorders>
-            <w:tcMar>
-              <w:top w:type="dxa" w:w="60"/>
-              <w:left w:type="dxa" w:w="100"/>
-              <w:bottom w:type="dxa" w:w="60"/>
-              <w:right w:type="dxa" w:w="100"/>
-            </w:tcMar>
-          </w:tcPr>
-          <w:p>
-            <w:r>
-              <w:t xml:space="preserve">73%</w:t>
-            </w:r>
-          </w:p>
-        </w:tc>
-        <w:tc>
-          <w:tcPr>
-            <w:tcW w:type="dxa" w:w="2638"/>
-            <w:tcBorders>
-              <w:top w:val="single" w:color="C7CCD6" w:sz="4"/>
-              <w:left w:val="single" w:color="C7CCD6" w:sz="4"/>
-              <w:bottom w:val="single" w:color="C7CCD6" w:sz="4"/>
-              <w:right w:val="single" w:color="C7CCD6" w:sz="4"/>
-            </w:tcBorders>
-            <w:tcMar>
-              <w:top w:type="dxa" w:w="60"/>
-              <w:left w:type="dxa" w:w="100"/>
-              <w:bottom w:type="dxa" w:w="60"/>
-              <w:right w:type="dxa" w:w="100"/>
-            </w:tcMar>
-          </w:tcPr>
-          <w:p>
-            <w:r>
-              <w:t xml:space="preserve">87%</w:t>
-            </w:r>
-          </w:p>
-        </w:tc>
-      </w:tr>
-      <w:tr>
-        <w:tc>
-          <w:tcPr>
-            <w:tcW w:type="dxa" w:w="4600"/>
-            <w:tcBorders>
-              <w:top w:val="single" w:color="C7CCD6" w:sz="4"/>
-              <w:left w:val="single" w:color="C7CCD6" w:sz="4"/>
-              <w:bottom w:val="single" w:color="C7CCD6" w:sz="4"/>
-              <w:right w:val="single" w:color="C7CCD6" w:sz="4"/>
-            </w:tcBorders>
-            <w:shd w:fill="F5F7FB" w:color="auto" w:val="clear"/>
-            <w:tcMar>
-              <w:top w:type="dxa" w:w="60"/>
-              <w:left w:type="dxa" w:w="100"/>
-              <w:bottom w:type="dxa" w:w="60"/>
-              <w:right w:type="dxa" w:w="100"/>
-            </w:tcMar>
-          </w:tcPr>
-          <w:p>
-            <w:r>
-              <w:t xml:space="preserve">Запросов с полностью верным топ‑3</w:t>
-            </w:r>
-          </w:p>
-        </w:tc>
-        <w:tc>
-          <w:tcPr>
-            <w:tcW w:type="dxa" w:w="2400"/>
-            <w:tcBorders>
-              <w:top w:val="single" w:color="C7CCD6" w:sz="4"/>
-              <w:left w:val="single" w:color="C7CCD6" w:sz="4"/>
-              <w:bottom w:val="single" w:color="C7CCD6" w:sz="4"/>
-              <w:right w:val="single" w:color="C7CCD6" w:sz="4"/>
-            </w:tcBorders>
-            <w:shd w:fill="F5F7FB" w:color="auto" w:val="clear"/>
-            <w:tcMar>
-              <w:top w:type="dxa" w:w="60"/>
-              <w:left w:type="dxa" w:w="100"/>
-              <w:bottom w:type="dxa" w:w="60"/>
-              <w:right w:type="dxa" w:w="100"/>
-            </w:tcMar>
-          </w:tcPr>
-          <w:p>
-            <w:r>
-              <w:t xml:space="preserve">21 из 30</w:t>
-            </w:r>
-          </w:p>
-        </w:tc>
-        <w:tc>
-          <w:tcPr>
-            <w:tcW w:type="dxa" w:w="2638"/>
-            <w:tcBorders>
-              <w:top w:val="single" w:color="C7CCD6" w:sz="4"/>
-              <w:left w:val="single" w:color="C7CCD6" w:sz="4"/>
-              <w:bottom w:val="single" w:color="C7CCD6" w:sz="4"/>
-              <w:right w:val="single" w:color="C7CCD6" w:sz="4"/>
-            </w:tcBorders>
-            <w:shd w:fill="F5F7FB" w:color="auto" w:val="clear"/>
-            <w:tcMar>
-              <w:top w:type="dxa" w:w="60"/>
-              <w:left w:type="dxa" w:w="100"/>
-              <w:bottom w:type="dxa" w:w="60"/>
-              <w:right w:type="dxa" w:w="100"/>
-            </w:tcMar>
-          </w:tcPr>
-          <w:p>
-            <w:r>
-              <w:t xml:space="preserve">26 из 30</w:t>
-            </w:r>
-          </w:p>
-        </w:tc>
-      </w:tr>
-      <w:tr>
-        <w:tc>
-          <w:tcPr>
-            <w:tcW w:type="dxa" w:w="4600"/>
-            <w:tcBorders>
-              <w:top w:val="single" w:color="C7CCD6" w:sz="4"/>
-              <w:left w:val="single" w:color="C7CCD6" w:sz="4"/>
-              <w:bottom w:val="single" w:color="C7CCD6" w:sz="4"/>
-              <w:right w:val="single" w:color="C7CCD6" w:sz="4"/>
-            </w:tcBorders>
-            <w:tcMar>
-              <w:top w:type="dxa" w:w="60"/>
-              <w:left w:type="dxa" w:w="100"/>
-              <w:bottom w:type="dxa" w:w="60"/>
-              <w:right w:type="dxa" w:w="100"/>
-            </w:tcMar>
-          </w:tcPr>
-          <w:p>
-            <w:r>
-              <w:t xml:space="preserve">Нужная модель в топ‑3 (дистрибуторы)</w:t>
-            </w:r>
-          </w:p>
-        </w:tc>
-        <w:tc>
-          <w:tcPr>
-            <w:tcW w:type="dxa" w:w="2400"/>
-            <w:tcBorders>
-              <w:top w:val="single" w:color="C7CCD6" w:sz="4"/>
-              <w:left w:val="single" w:color="C7CCD6" w:sz="4"/>
-              <w:bottom w:val="single" w:color="C7CCD6" w:sz="4"/>
-              <w:right w:val="single" w:color="C7CCD6" w:sz="4"/>
-            </w:tcBorders>
-            <w:tcMar>
-              <w:top w:type="dxa" w:w="60"/>
-              <w:left w:type="dxa" w:w="100"/>
-              <w:bottom w:type="dxa" w:w="60"/>
-              <w:right w:type="dxa" w:w="100"/>
-            </w:tcMar>
-          </w:tcPr>
-          <w:p>
-            <w:r>
-              <w:t xml:space="preserve">не измерялось</w:t>
-            </w:r>
-          </w:p>
-        </w:tc>
-        <w:tc>
-          <w:tcPr>
-            <w:tcW w:type="dxa" w:w="2638"/>
-            <w:tcBorders>
-              <w:top w:val="single" w:color="C7CCD6" w:sz="4"/>
-              <w:left w:val="single" w:color="C7CCD6" w:sz="4"/>
-              <w:bottom w:val="single" w:color="C7CCD6" w:sz="4"/>
-              <w:right w:val="single" w:color="C7CCD6" w:sz="4"/>
-            </w:tcBorders>
-            <w:tcMar>
-              <w:top w:type="dxa" w:w="60"/>
-              <w:left w:type="dxa" w:w="100"/>
-              <w:bottom w:type="dxa" w:w="60"/>
-              <w:right w:type="dxa" w:w="100"/>
-            </w:tcMar>
-          </w:tcPr>
-          <w:p>
-            <w:r>
-              <w:t xml:space="preserve">100% (20 запросов)</w:t>
-            </w:r>
-          </w:p>
-        </w:tc>
-      </w:tr>
-      <w:tr>
-        <w:tc>
-          <w:tcPr>
-            <w:tcW w:type="dxa" w:w="4600"/>
-            <w:tcBorders>
-              <w:top w:val="single" w:color="C7CCD6" w:sz="4"/>
-              <w:left w:val="single" w:color="C7CCD6" w:sz="4"/>
-              <w:bottom w:val="single" w:color="C7CCD6" w:sz="4"/>
-              <w:right w:val="single" w:color="C7CCD6" w:sz="4"/>
-            </w:tcBorders>
-            <w:shd w:fill="F5F7FB" w:color="auto" w:val="clear"/>
-            <w:tcMar>
-              <w:top w:type="dxa" w:w="60"/>
-              <w:left w:type="dxa" w:w="100"/>
-              <w:bottom w:type="dxa" w:w="60"/>
-              <w:right w:type="dxa" w:w="100"/>
-            </w:tcMar>
-          </w:tcPr>
-          <w:p>
-            <w:r>
-              <w:t xml:space="preserve">Пустые выдачи</w:t>
-            </w:r>
-          </w:p>
-        </w:tc>
-        <w:tc>
-          <w:tcPr>
-            <w:tcW w:type="dxa" w:w="2400"/>
-            <w:tcBorders>
-              <w:top w:val="single" w:color="C7CCD6" w:sz="4"/>
-              <w:left w:val="single" w:color="C7CCD6" w:sz="4"/>
-              <w:bottom w:val="single" w:color="C7CCD6" w:sz="4"/>
-              <w:right w:val="single" w:color="C7CCD6" w:sz="4"/>
-            </w:tcBorders>
-            <w:shd w:fill="F5F7FB" w:color="auto" w:val="clear"/>
-            <w:tcMar>
-              <w:top w:type="dxa" w:w="60"/>
-              <w:left w:type="dxa" w:w="100"/>
-              <w:bottom w:type="dxa" w:w="60"/>
-              <w:right w:type="dxa" w:w="100"/>
-            </w:tcMar>
-          </w:tcPr>
-          <w:p>
-            <w:r>
-              <w:t xml:space="preserve">6 из 30</w:t>
-            </w:r>
-          </w:p>
-        </w:tc>
-        <w:tc>
-          <w:tcPr>
-            <w:tcW w:type="dxa" w:w="2638"/>
-            <w:tcBorders>
-              <w:top w:val="single" w:color="C7CCD6" w:sz="4"/>
-              <w:left w:val="single" w:color="C7CCD6" w:sz="4"/>
-              <w:bottom w:val="single" w:color="C7CCD6" w:sz="4"/>
-              <w:right w:val="single" w:color="C7CCD6" w:sz="4"/>
-            </w:tcBorders>
-            <w:shd w:fill="F5F7FB" w:color="auto" w:val="clear"/>
-            <w:tcMar>
-              <w:top w:type="dxa" w:w="60"/>
-              <w:left w:type="dxa" w:w="100"/>
-              <w:bottom w:type="dxa" w:w="60"/>
-              <w:right w:type="dxa" w:w="100"/>
-            </w:tcMar>
-          </w:tcPr>
-          <w:p>
-            <w:r>
-              <w:t xml:space="preserve">3 из 30</w:t>
-            </w:r>
-          </w:p>
-        </w:tc>
-      </w:tr>
-      <w:tr>
-        <w:tc>
-          <w:tcPr>
-            <w:tcW w:type="dxa" w:w="4600"/>
-            <w:tcBorders>
-              <w:top w:val="single" w:color="C7CCD6" w:sz="4"/>
-              <w:left w:val="single" w:color="C7CCD6" w:sz="4"/>
-              <w:bottom w:val="single" w:color="C7CCD6" w:sz="4"/>
-              <w:right w:val="single" w:color="C7CCD6" w:sz="4"/>
-            </w:tcBorders>
-            <w:tcMar>
-              <w:top w:type="dxa" w:w="60"/>
-              <w:left w:type="dxa" w:w="100"/>
-              <w:bottom w:type="dxa" w:w="60"/>
-              <w:right w:type="dxa" w:w="100"/>
-            </w:tcMar>
-          </w:tcPr>
-          <w:p>
-            <w:r>
-              <w:t xml:space="preserve">Доля «в наличии» в топ‑3</w:t>
-            </w:r>
-          </w:p>
-        </w:tc>
-        <w:tc>
-          <w:tcPr>
-            <w:tcW w:type="dxa" w:w="2400"/>
-            <w:tcBorders>
-              <w:top w:val="single" w:color="C7CCD6" w:sz="4"/>
-              <w:left w:val="single" w:color="C7CCD6" w:sz="4"/>
-              <w:bottom w:val="single" w:color="C7CCD6" w:sz="4"/>
-              <w:right w:val="single" w:color="C7CCD6" w:sz="4"/>
-            </w:tcBorders>
-            <w:tcMar>
-              <w:top w:type="dxa" w:w="60"/>
-              <w:left w:type="dxa" w:w="100"/>
-              <w:bottom w:type="dxa" w:w="60"/>
-              <w:right w:type="dxa" w:w="100"/>
-            </w:tcMar>
-          </w:tcPr>
-          <w:p>
-            <w:r>
-              <w:t xml:space="preserve">68%</w:t>
-            </w:r>
-          </w:p>
-        </w:tc>
-        <w:tc>
-          <w:tcPr>
-            <w:tcW w:type="dxa" w:w="2638"/>
-            <w:tcBorders>
-              <w:top w:val="single" w:color="C7CCD6" w:sz="4"/>
-              <w:left w:val="single" w:color="C7CCD6" w:sz="4"/>
-              <w:bottom w:val="single" w:color="C7CCD6" w:sz="4"/>
-              <w:right w:val="single" w:color="C7CCD6" w:sz="4"/>
-            </w:tcBorders>
-            <w:tcMar>
-              <w:top w:type="dxa" w:w="60"/>
-              <w:left w:type="dxa" w:w="100"/>
-              <w:bottom w:type="dxa" w:w="60"/>
-              <w:right w:type="dxa" w:w="100"/>
-            </w:tcMar>
-          </w:tcPr>
-          <w:p>
-            <w:r>
-              <w:t xml:space="preserve">70–73%</w:t>
-            </w:r>
-          </w:p>
-        </w:tc>
-      </w:tr>
-    </w:tbl>
-    <w:p>
-      <w:pPr>
-        <w:spacing w:after="120"/>
-      </w:pPr>
-      <w:r>
-        <w:t xml:space="preserve">Оставшиеся пустые запросы — детали Kyocera (302N494021, 302K994020) и МФУ HP M247: их нет на подключённых площадках, нужны API дистрибьюторов.</w:t>
-      </w:r>
-    </w:p>
-    <w:p>
-      <w:pPr>
-        <w:pBdr>
-          <w:left w:val="single" w:color="4F46E5" w:sz="18" w:space="8"/>
-        </w:pBdr>
-        <w:shd w:fill="EEF2FF" w:color="auto" w:val="clear"/>
-        <w:spacing w:after="160" w:before="120"/>
-        <w:ind w:left="200"/>
-      </w:pPr>
-      <w:r>
-        <w:t xml:space="preserve">Помогите сделать набор точнее: присылайте реальные запросы, по которым вы ждёте конкретный результат, — они станут частью проверки.</w:t>
-      </w:r>
-    </w:p>
-    <w:p>
-      <w:pPr>
-        <w:pStyle w:val="Heading1"/>
-        <w:pageBreakBefore/>
-      </w:pPr>
-      <w:bookmarkStart w:name="_Toc45" w:id="45"/>
-      <w:r>
-        <w:t xml:space="preserve">13. Что планируется дальше</w:t>
-      </w:r>
-      <w:bookmarkEnd w:id="45"/>
     </w:p>
     <w:p>
       <w:pPr>
@@ -10037,11 +9456,11 @@
         <w:pStyle w:val="Heading1"/>
         <w:pageBreakBefore/>
       </w:pPr>
-      <w:bookmarkStart w:name="_Toc46" w:id="46"/>
-      <w:r>
-        <w:t xml:space="preserve">14. Частые вопросы</w:t>
-      </w:r>
-      <w:bookmarkEnd w:id="46"/>
+      <w:bookmarkStart w:name="_Toc45" w:id="45"/>
+      <w:r>
+        <w:t xml:space="preserve">13. Частые вопросы</w:t>
+      </w:r>
+      <w:bookmarkEnd w:id="45"/>
     </w:p>
     <w:p>
       <w:pPr>
@@ -10060,7 +9479,7 @@
         <w:spacing w:after="120"/>
       </w:pPr>
       <w:r>
-        <w:t xml:space="preserve">Площадка временно выключена: она показывает серверу капчу. Остальные источники работают.</w:t>
+        <w:t xml:space="preserve">Площадка временно выключена: она не пускает автоматический поиск. Остальные источники работают.</w:t>
       </w:r>
     </w:p>
     <w:p>

</xml_diff>